<commit_message>
court(mich-sc/motion-brief): latex and docx regenerated on the model of fb-595.54.82, latex gated, docx reported (fb-595.54.31)
Co-Authored-By: Claude Opus 5.5 <noreply@anthropic.com>

(fb-595.54.31)
</commit_message>
<xml_diff>
--- a/courts/sixth-circuit/michigan/state/supreme-court/motion-brief/usage/OUTPUT-motion-brief.docx
+++ b/courts/sixth-circuit/michigan/state/supreme-court/motion-brief/usage/OUTPUT-motion-brief.docx
@@ -2390,7 +2390,7 @@
         <w:pStyle w:val="BodyText"/>
       </w:pPr>
       <w:r>
-        <w:t xml:space="preserve">21. But Option 2 produces several complications. First, Section 4(2) allows only for a “12-month period” for calculating the inflation adjustment, which seems inconsistent with the Court’s stated goal of accounting for the last “six years” of inflation. (Op, p 33.) Second, Section 4(2) instructs that adjustments for inflation must be made “[e]very October beginning in October, 2022, . . .” But, for the same reasons explained in footnote 1 above, October CPI-W values would not be available until November 2022; only September 2022 values would be available in October 2022. This is reflected in the later portion of Subsection 4(2) providing for the use of the “most recent 12-month period for which data are available.” Third, Section 4(2) directs the State Treasurer to calculate the inflation increase by “multiplying the otherwise applicable minimum wage by the 12-month percentage increase[.]” This phrase is ambiguous, as it could mean either 1) starting with September (or October) 2022 and looking back 12 months or 2) starting with September (or October) 2022 and looking back at the average of the 12 most recent monthly values.</w:t>
+        <w:t xml:space="preserve">21. But Option 2 produces several complications. First, Section 4(2) allows only for a “12-month period” for calculating the inflation adjustment, which seems inconsistent with the Court’s stated goal of accounting for the last “six years” of inflation. (Op, p 33.) Second, Section 4(2) instructs that adjustments for inflation must be made “[e]very October beginning in October, 2022, . . .” But, for the same reasons explained in footnote 1 above, October CPI-W values would not be available until November 2022; only September 2022 values would be available in October 2022. This is reflected in the later portion of Subsection 4(2) providing for the use of the “most recent 12-month period for which data are available.” Third, Section 4(2) directs the State Treasurer to calculate the inflation increase by “multiplying the otherwise applicable minimum wage by the 12-month percentage increase[.]” This phrase is ambiguous, as it could mean either 1) starting with September (or October) 2022 and looking back 12 months or 2) starting with September (or October) 2022 and looking back at the average of the 12 most recent monthly values.</w:t>
       </w:r>
     </w:p>
     <w:p>
@@ -2626,7 +2626,7 @@
         <w:pStyle w:val="BodyText"/>
       </w:pPr>
       <w:r>
-        <w:t xml:space="preserve">31. Second, the Wage Act does not provide for a tip “credit.” Rather, the Wage Act provided for tipped wages to be a specific percentage of the base minimum wage to be increased over time. See Section 4d(2). Thus, the State asks whether the Court’s reference in footnote 23 to “The tip credit will be . . . .” should have been to “The rate under Section 4d(2) will be . . . .” Absent clarification, LEO intends to implement the “tip credit” as a baseline minimum wage with corresponding rate increases under Section 4d(2).</w:t>
+        <w:t xml:space="preserve">31. Second, the Wage Act does not provide for a tip “credit.” Rather, the Wage Act provided for tipped wages to be a specific percentage of the base minimum wage to be increased over time. See Section 4d(2). Thus, the State asks whether the Court’s reference in footnote 23 to “The tip credit will be . . . .” should have been to “The rate under Section 4d(2) will be . . . .” Absent clarification, LEO intends to implement the “tip credit” as a baseline minimum wage with corresponding rate increases under Section 4d(2).</w:t>
       </w:r>
     </w:p>
     <w:p>
@@ -3447,7 +3447,7 @@
         <w:t xml:space="preserve"> </w:t>
       </w:r>
       <w:r>
-        <w:t xml:space="preserve">In footnote 21, the Court identifies a CPI (Consumer Price Index) Inflation calculator for CPI for all Urban Consumers (CPI-U). But Section 4(2) of the Wage Act uses the CPI-W. While the differences between these indexes are beyond the scope of this motion, they are different. Indeed, the Bureau of Labor and Statistics explains that the CPI-U and CPI-W are not the same: “Both the CPI-U and C-CPI-U are indexes designed to measure price changes faced by urban consumers, while the CPI-W is designed to measure price changes faced by urban wage earners and clerical workers. Population coverage is the only difference between the CPI-U and CPI-W.” Frequently Asked Questions about the Chained Consumer Price Index for All Urban Consumers (C-CPI-U), https://www.bls.gov/​cpi/​additional-resources/​chained-cpi-questions-and-answers.htm (accessed August 12, 2024).</w:t>
+        <w:t xml:space="preserve">In footnote 21, the Court identifies a CPI (Consumer Price Index) Inflation calculator for CPI for all Urban Consumers (CPI-U). But Section 4(2) of the Wage Act uses the CPI-W. While the differences between these indexes are beyond the scope of this motion, they are different. Indeed, the Bureau of Labor and Statistics explains that the CPI-U and CPI-W are not the same: “Both the CPI-U and C-CPI-U are indexes designed to measure price changes faced by urban consumers, while the CPI-W is designed to measure price changes faced by urban wage earners and clerical workers. Population coverage is the only difference between the CPI-U and CPI-W.” Frequently Asked Questions about the Chained Consumer Price Index for All Urban Consumers (C-CPI-U), https://​www.​bls.​gov/​cpi/​additional-​resources/​chained-​cpi-​questions-​and-​answers.​htm (accessed August 12, 2024).</w:t>
       </w:r>
     </w:p>
   </w:footnote>
@@ -4124,6 +4124,7 @@
     <w:unhideWhenUsed/>
     <w:qFormat/>
     <w:pPr>
+      <w:keepLines/>
       <w:spacing w:before="0" w:after="110" w:line="276" w:lineRule="exact"/>
     </w:pPr>
     <w:rPr>
@@ -4374,6 +4375,33 @@
     <w:pPr>
       <w:spacing w:before="0" w:after="0" w:line="276" w:lineRule="exact"/>
       <w:ind w:left="2160" w:hanging="720"/>
+    </w:pPr>
+  </w:style>
+  <w:style w:type="paragraph" w:customStyle="1" w:styleId="XdQuoteList1">
+    <w:name w:val="Xd Quote List 1"/>
+    <w:basedOn w:val="Normal"/>
+    <w:qFormat/>
+    <w:pPr>
+      <w:spacing w:before="0" w:after="0" w:line="276" w:lineRule="exact"/>
+      <w:ind w:left="1440" w:right="720" w:hanging="720"/>
+    </w:pPr>
+  </w:style>
+  <w:style w:type="paragraph" w:customStyle="1" w:styleId="XdQuoteList2">
+    <w:name w:val="Xd Quote List 2"/>
+    <w:basedOn w:val="Normal"/>
+    <w:qFormat/>
+    <w:pPr>
+      <w:spacing w:before="0" w:after="0" w:line="276" w:lineRule="exact"/>
+      <w:ind w:left="2160" w:right="720" w:hanging="720"/>
+    </w:pPr>
+  </w:style>
+  <w:style w:type="paragraph" w:customStyle="1" w:styleId="XdQuoteList3">
+    <w:name w:val="Xd Quote List 3"/>
+    <w:basedOn w:val="Normal"/>
+    <w:qFormat/>
+    <w:pPr>
+      <w:spacing w:before="0" w:after="0" w:line="276" w:lineRule="exact"/>
+      <w:ind w:left="2880" w:right="720" w:hanging="720"/>
     </w:pPr>
   </w:style>
   <w:style w:type="paragraph" w:customStyle="1" w:styleId="XdList1">

</xml_diff>